<commit_message>
Revise to v1.22.0 (Round-20 graded revisions): unify primary/sensitivity on locked-L1 pre-registered framework; reconcile FIS1 erythroid-module framing with its 28-day-death association; fix Table 1 markdown pipe leak; replace recapitulate with within-cohort confirmation framing; add endpoint-dilution + external-EPV + label-independence + neutrophilic-arm caveats; add Landelle 2013 + Hotchkiss 2001 citations (40 Vancouver refs); reconcile cover-letter title/de-prioritisation; unify Fig.S labels; disclose MR-layer removal; rebuild BMC docx; update build/verify/audit guards
</commit_message>
<xml_diff>
--- a/07_submission_bmc_v1.21.0/Cover_Letter.docx
+++ b/07_submission_bmc_v1.21.0/Cover_Letter.docx
@@ -25,7 +25,7 @@
           <w:b w:val="0"/>
           <w:i w:val="0"/>
         </w:rPr>
-        <w:t xml:space="preserve">Please find enclosed our manuscript entitled "A reproducible pipeline confirms the MARS Mars1 immunoparalysis program and externally evaluates a 30-gene sepsis prognostic signature" for consideration as a </w:t>
+        <w:t xml:space="preserve">Please find enclosed our manuscript entitled "A reproducible, fully auditable pipeline confirms within-cohort the MARS Mars1 immunoparalysis program and delivers an honest external validation of a 30-gene sepsis prognostic signature" for consideration as a </w:t>
       </w:r>
       <w:r>
         <w:rPr>
@@ -112,7 +112,7 @@
           <w:b w:val="0"/>
           <w:i w:val="0"/>
         </w:rPr>
-        <w:t>The five confirmed immune hubs recapitulate the established MARS Mars1 antigen-presentation program (a near-replication), and we prioritise seven immune-modulating agents for repurposing through an explicit positive-control gate.</w:t>
+        <w:t>The five confirmed immune hubs confirm within-cohort the established MARS Mars1 antigen-presentation program (a within-cohort confirmation, not an independent replication — the Mars1 labels originate from the MARS consortium's own clustering of this same cohort), and we annotate seven immune-modulating agents as hypothesis-generating repositioning candidates; their curated immune-response concordance lies at or below the study's own 0.84 background and the LINCS L1000 positive-control gate was non-discriminating (the immunosuppressant prednisone ranked in the 3.2nd percentile), so none is prioritised by significance.</w:t>
       </w:r>
     </w:p>
     <w:p>
@@ -156,6 +156,34 @@
           <w:i w:val="0"/>
         </w:rPr>
         <w:t xml:space="preserve"> claim novel hub-gene discovery. We state explicitly that the biology is established and that our contribution is confirmation, validation and method transparency.</w:t>
+      </w:r>
+    </w:p>
+    <w:p>
+      <w:pPr>
+        <w:pStyle w:val="ListBullet"/>
+        <w:spacing w:after="40"/>
+      </w:pPr>
+      <w:r>
+        <w:rPr>
+          <w:rFonts w:ascii="Times New Roman" w:hAnsi="Times New Roman"/>
+          <w:b w:val="0"/>
+          <w:i w:val="0"/>
+        </w:rPr>
+        <w:t>This is a computational-biology / methods-and-resources contribution submitted as a Research article; its novelty is methodological and infrastructural (auditable pipeline, honest external validation, experimental blueprint), not biological.</w:t>
+      </w:r>
+    </w:p>
+    <w:p>
+      <w:pPr>
+        <w:pStyle w:val="ListBullet"/>
+        <w:spacing w:after="40"/>
+      </w:pPr>
+      <w:r>
+        <w:rPr>
+          <w:rFonts w:ascii="Times New Roman" w:hAnsi="Times New Roman"/>
+          <w:b w:val="0"/>
+          <w:i w:val="0"/>
+        </w:rPr>
+        <w:t>An earlier draft (≤ v1.19) included a two-sample Mendelian-randomisation layer; it was removed in v1.20.0 because it did not satisfy the study's three-tier positive-anchor design and is not part of the reported contribution.</w:t>
       </w:r>
     </w:p>
     <w:p>

</xml_diff>